<commit_message>
docs(contracts): commit contract WIP, ARCH reports, docs, site
Commit the previously-uncommitted working-tree content:
- contracts/v1: the in-progress contract authoring across modules, while
  preserving this session's hygiene (orphan/unnumbered specs stay removed,
  openapi-20 keeps its operationIds).
- ARCH-reports/, Documentation/, reports/, scaffold/, site/, and the Operan
  Manual Runbook.

Module source under modules/ is intentionally NOT included here: the
validated, published versions already on main are authoritative and the
working-tree copies were stale. A root .gitignore now excludes .DS_Store,
coverage/test artifacts, and editor files.

Co-Authored-By: Claude Opus 4.8 <noreply@anthropic.com>
</commit_message>
<xml_diff>
--- a/Documentation/prd.docx
+++ b/Documentation/prd.docx
@@ -266,7 +266,7 @@
           <w:noProof/>
           <w:kern w:val="0"/>
         </w:rPr>
-        <w:pict w14:anchorId="579A0F26">
+        <w:pict w14:anchorId="4A0C0B06">
           <v:rect id="_x0000_i1063" alt="" style="width:468pt;height:.05pt;mso-width-percent:0;mso-height-percent:0;mso-width-percent:0;mso-height-percent:0" o:hralign="center" o:hrstd="t" o:hr="t" fillcolor="#a0a0a0" stroked="f"/>
         </w:pict>
       </w:r>
@@ -349,7 +349,7 @@
           <w:szCs w:val="36"/>
           <w14:ligatures w14:val="none"/>
         </w:rPr>
-        <w:t>ORCHESTRA</w:t>
+        <w:t>OPERAN</w:t>
       </w:r>
     </w:p>
     <w:p>
@@ -394,7 +394,7 @@
           <w:noProof/>
           <w:kern w:val="0"/>
         </w:rPr>
-        <w:pict w14:anchorId="59D7C18F">
+        <w:pict w14:anchorId="37574CDF">
           <v:rect id="_x0000_i1062" alt="" style="width:468pt;height:.05pt;mso-width-percent:0;mso-height-percent:0;mso-width-percent:0;mso-height-percent:0" o:hralign="center" o:hrstd="t" o:hr="t" fillcolor="#a0a0a0" stroked="f"/>
         </w:pict>
       </w:r>
@@ -441,7 +441,31 @@
           <w:kern w:val="0"/>
           <w14:ligatures w14:val="none"/>
         </w:rPr>
-        <w:t>ORCHESTRA is a multi-tenant enterprise platform that enables organizations to deploy fully operational AI-native departments on demand using coordinated agent swarms, institutional memory systems, workflow orchestration, and governance-driven execution frameworks.</w:t>
+        <w:t>OPERAN</w:t>
+      </w:r>
+      <w:r>
+        <w:rPr>
+          <w:rFonts w:ascii="Times New Roman" w:eastAsia="Times New Roman" w:hAnsi="Times New Roman" w:cs="Times New Roman"/>
+          <w:kern w:val="0"/>
+          <w14:ligatures w14:val="none"/>
+        </w:rPr>
+        <w:t xml:space="preserve"> is a multi-tenant enterprise platform that enables organizations to deploy fully operational AI-native departments on demand using coordinated agent swarms, institutional memory systems, workflow </w:t>
+      </w:r>
+      <w:r>
+        <w:rPr>
+          <w:rFonts w:ascii="Times New Roman" w:eastAsia="Times New Roman" w:hAnsi="Times New Roman" w:cs="Times New Roman"/>
+          <w:kern w:val="0"/>
+          <w14:ligatures w14:val="none"/>
+        </w:rPr>
+        <w:t>Operan</w:t>
+      </w:r>
+      <w:r>
+        <w:rPr>
+          <w:rFonts w:ascii="Times New Roman" w:eastAsia="Times New Roman" w:hAnsi="Times New Roman" w:cs="Times New Roman"/>
+          <w:kern w:val="0"/>
+          <w14:ligatures w14:val="none"/>
+        </w:rPr>
+        <w:t>tion, and governance-driven execution frameworks.</w:t>
       </w:r>
     </w:p>
     <w:p>
@@ -690,7 +714,7 @@
           <w:noProof/>
           <w:kern w:val="0"/>
         </w:rPr>
-        <w:pict w14:anchorId="1C070421">
+        <w:pict w14:anchorId="22917B75">
           <v:rect id="_x0000_i1061" alt="" style="width:468pt;height:.05pt;mso-width-percent:0;mso-height-percent:0;mso-width-percent:0;mso-height-percent:0" o:hralign="center" o:hrstd="t" o:hr="t" fillcolor="#a0a0a0" stroked="f"/>
         </w:pict>
       </w:r>
@@ -755,7 +779,7 @@
           <w:noProof/>
           <w:kern w:val="0"/>
         </w:rPr>
-        <w:pict w14:anchorId="72E2AFD4">
+        <w:pict w14:anchorId="04AA35F6">
           <v:rect id="_x0000_i1060" alt="" style="width:468pt;height:.05pt;mso-width-percent:0;mso-height-percent:0;mso-width-percent:0;mso-height-percent:0" o:hralign="center" o:hrstd="t" o:hr="t" fillcolor="#a0a0a0" stroked="f"/>
         </w:pict>
       </w:r>
@@ -992,7 +1016,15 @@
           <w:kern w:val="0"/>
           <w14:ligatures w14:val="none"/>
         </w:rPr>
-        <w:t>ORCHESTRA provides this through:</w:t>
+        <w:t>OPERAN</w:t>
+      </w:r>
+      <w:r>
+        <w:rPr>
+          <w:rFonts w:ascii="Times New Roman" w:eastAsia="Times New Roman" w:hAnsi="Times New Roman" w:cs="Times New Roman"/>
+          <w:kern w:val="0"/>
+          <w14:ligatures w14:val="none"/>
+        </w:rPr>
+        <w:t xml:space="preserve"> provides this through:</w:t>
       </w:r>
     </w:p>
     <w:p>
@@ -1121,7 +1153,7 @@
           <w:noProof/>
           <w:kern w:val="0"/>
         </w:rPr>
-        <w:pict w14:anchorId="371E9266">
+        <w:pict w14:anchorId="3C64D018">
           <v:rect id="_x0000_i1059" alt="" style="width:468pt;height:.05pt;mso-width-percent:0;mso-height-percent:0;mso-width-percent:0;mso-height-percent:0" o:hralign="center" o:hrstd="t" o:hr="t" fillcolor="#a0a0a0" stroked="f"/>
         </w:pict>
       </w:r>
@@ -1327,7 +1359,7 @@
           <w:noProof/>
           <w:kern w:val="0"/>
         </w:rPr>
-        <w:pict w14:anchorId="30005B5B">
+        <w:pict w14:anchorId="066F4977">
           <v:rect id="_x0000_i1058" alt="" style="width:468pt;height:.05pt;mso-width-percent:0;mso-height-percent:0;mso-width-percent:0;mso-height-percent:0" o:hralign="center" o:hrstd="t" o:hr="t" fillcolor="#a0a0a0" stroked="f"/>
         </w:pict>
       </w:r>
@@ -1418,7 +1450,23 @@
           <w:kern w:val="0"/>
           <w14:ligatures w14:val="none"/>
         </w:rPr>
-        <w:t>isolated orchestration</w:t>
+        <w:t xml:space="preserve">isolated </w:t>
+      </w:r>
+      <w:r>
+        <w:rPr>
+          <w:rFonts w:ascii="Times New Roman" w:eastAsia="Times New Roman" w:hAnsi="Times New Roman" w:cs="Times New Roman"/>
+          <w:kern w:val="0"/>
+          <w14:ligatures w14:val="none"/>
+        </w:rPr>
+        <w:t>Operan</w:t>
+      </w:r>
+      <w:r>
+        <w:rPr>
+          <w:rFonts w:ascii="Times New Roman" w:eastAsia="Times New Roman" w:hAnsi="Times New Roman" w:cs="Times New Roman"/>
+          <w:kern w:val="0"/>
+          <w14:ligatures w14:val="none"/>
+        </w:rPr>
+        <w:t>tion</w:t>
       </w:r>
     </w:p>
     <w:p>
@@ -1524,7 +1572,7 @@
           <w:noProof/>
           <w:kern w:val="0"/>
         </w:rPr>
-        <w:pict w14:anchorId="1D13AD51">
+        <w:pict w14:anchorId="5FEEC984">
           <v:rect id="_x0000_i1057" alt="" style="width:468pt;height:.05pt;mso-width-percent:0;mso-height-percent:0;mso-width-percent:0;mso-height-percent:0" o:hralign="center" o:hrstd="t" o:hr="t" fillcolor="#a0a0a0" stroked="f"/>
         </w:pict>
       </w:r>
@@ -1784,7 +1832,7 @@
           <w:noProof/>
           <w:kern w:val="0"/>
         </w:rPr>
-        <w:pict w14:anchorId="504E3A84">
+        <w:pict w14:anchorId="121E10D2">
           <v:rect id="_x0000_i1056" alt="" style="width:468pt;height:.05pt;mso-width-percent:0;mso-height-percent:0;mso-width-percent:0;mso-height-percent:0" o:hralign="center" o:hrstd="t" o:hr="t" fillcolor="#a0a0a0" stroked="f"/>
         </w:pict>
       </w:r>
@@ -1981,7 +2029,7 @@
           <w:noProof/>
           <w:kern w:val="0"/>
         </w:rPr>
-        <w:pict w14:anchorId="783B8366">
+        <w:pict w14:anchorId="73EE56FB">
           <v:rect id="_x0000_i1055" alt="" style="width:468pt;height:.05pt;mso-width-percent:0;mso-height-percent:0;mso-width-percent:0;mso-height-percent:0" o:hralign="center" o:hrstd="t" o:hr="t" fillcolor="#a0a0a0" stroked="f"/>
         </w:pict>
       </w:r>
@@ -2064,7 +2112,7 @@
           <w:noProof/>
           <w:kern w:val="0"/>
         </w:rPr>
-        <w:pict w14:anchorId="74565E9B">
+        <w:pict w14:anchorId="62505BEB">
           <v:rect id="_x0000_i1054" alt="" style="width:468pt;height:.05pt;mso-width-percent:0;mso-height-percent:0;mso-width-percent:0;mso-height-percent:0" o:hralign="center" o:hrstd="t" o:hr="t" fillcolor="#a0a0a0" stroked="f"/>
         </w:pict>
       </w:r>
@@ -2403,7 +2451,27 @@
           <w:szCs w:val="20"/>
           <w14:ligatures w14:val="none"/>
         </w:rPr>
-        <w:t>│          ORCHESTRATION LAYER            │</w:t>
+        <w:t xml:space="preserve">│          </w:t>
+      </w:r>
+      <w:r>
+        <w:rPr>
+          <w:rFonts w:ascii="Courier New" w:eastAsia="Times New Roman" w:hAnsi="Courier New" w:cs="Courier New"/>
+          <w:kern w:val="0"/>
+          <w:sz w:val="20"/>
+          <w:szCs w:val="20"/>
+          <w14:ligatures w14:val="none"/>
+        </w:rPr>
+        <w:t>OPERAN</w:t>
+      </w:r>
+      <w:r>
+        <w:rPr>
+          <w:rFonts w:ascii="Courier New" w:eastAsia="Times New Roman" w:hAnsi="Courier New" w:cs="Courier New"/>
+          <w:kern w:val="0"/>
+          <w:sz w:val="20"/>
+          <w:szCs w:val="20"/>
+          <w14:ligatures w14:val="none"/>
+        </w:rPr>
+        <w:t>TION LAYER            │</w:t>
       </w:r>
     </w:p>
     <w:p>
@@ -3662,7 +3730,7 @@
           <w:noProof/>
           <w:kern w:val="0"/>
         </w:rPr>
-        <w:pict w14:anchorId="2E583DE6">
+        <w:pict w14:anchorId="3F758E00">
           <v:rect id="_x0000_i1053" alt="" style="width:468pt;height:.05pt;mso-width-percent:0;mso-height-percent:0;mso-width-percent:0;mso-height-percent:0" o:hralign="center" o:hrstd="t" o:hr="t" fillcolor="#a0a0a0" stroked="f"/>
         </w:pict>
       </w:r>
@@ -4265,7 +4333,7 @@
           <w:noProof/>
           <w:kern w:val="0"/>
         </w:rPr>
-        <w:pict w14:anchorId="6A477A48">
+        <w:pict w14:anchorId="1C255E1D">
           <v:rect id="_x0000_i1052" alt="" style="width:468pt;height:.05pt;mso-width-percent:0;mso-height-percent:0;mso-width-percent:0;mso-height-percent:0" o:hralign="center" o:hrstd="t" o:hr="t" fillcolor="#a0a0a0" stroked="f"/>
         </w:pict>
       </w:r>
@@ -4769,7 +4837,7 @@
           <w:noProof/>
           <w:kern w:val="0"/>
         </w:rPr>
-        <w:pict w14:anchorId="6C68CC93">
+        <w:pict w14:anchorId="66117AB0">
           <v:rect id="_x0000_i1051" alt="" style="width:468pt;height:.05pt;mso-width-percent:0;mso-height-percent:0;mso-width-percent:0;mso-height-percent:0" o:hralign="center" o:hrstd="t" o:hr="t" fillcolor="#a0a0a0" stroked="f"/>
         </w:pict>
       </w:r>
@@ -4798,17 +4866,41 @@
           <w:szCs w:val="48"/>
           <w14:ligatures w14:val="none"/>
         </w:rPr>
-        <w:t>MODULE 03 — AGENT ORCHESTRATION ENGINE</w:t>
-      </w:r>
-    </w:p>
-    <w:p>
-      <w:pPr>
-        <w:spacing w:before="100" w:beforeAutospacing="1" w:after="100" w:afterAutospacing="1" w:line="240" w:lineRule="auto"/>
-        <w:outlineLvl w:val="1"/>
+        <w:t xml:space="preserve">MODULE 03 — AGENT </w:t>
+      </w:r>
+      <w:r>
         <w:rPr>
           <w:rFonts w:ascii="Times New Roman" w:eastAsia="Times New Roman" w:hAnsi="Times New Roman" w:cs="Times New Roman"/>
           <w:b/>
           <w:bCs/>
+          <w:kern w:val="36"/>
+          <w:sz w:val="48"/>
+          <w:szCs w:val="48"/>
+          <w14:ligatures w14:val="none"/>
+        </w:rPr>
+        <w:t>OPERAN</w:t>
+      </w:r>
+      <w:r>
+        <w:rPr>
+          <w:rFonts w:ascii="Times New Roman" w:eastAsia="Times New Roman" w:hAnsi="Times New Roman" w:cs="Times New Roman"/>
+          <w:b/>
+          <w:bCs/>
+          <w:kern w:val="36"/>
+          <w:sz w:val="48"/>
+          <w:szCs w:val="48"/>
+          <w14:ligatures w14:val="none"/>
+        </w:rPr>
+        <w:t>TION ENGINE</w:t>
+      </w:r>
+    </w:p>
+    <w:p>
+      <w:pPr>
+        <w:spacing w:before="100" w:beforeAutospacing="1" w:after="100" w:afterAutospacing="1" w:line="240" w:lineRule="auto"/>
+        <w:outlineLvl w:val="1"/>
+        <w:rPr>
+          <w:rFonts w:ascii="Times New Roman" w:eastAsia="Times New Roman" w:hAnsi="Times New Roman" w:cs="Times New Roman"/>
+          <w:b/>
+          <w:bCs/>
           <w:kern w:val="0"/>
           <w:sz w:val="36"/>
           <w:szCs w:val="36"/>
@@ -5091,7 +5183,23 @@
           <w:kern w:val="0"/>
           <w14:ligatures w14:val="none"/>
         </w:rPr>
-        <w:t>Event-driven graph orchestration.</w:t>
+        <w:t xml:space="preserve">Event-driven graph </w:t>
+      </w:r>
+      <w:r>
+        <w:rPr>
+          <w:rFonts w:ascii="Times New Roman" w:eastAsia="Times New Roman" w:hAnsi="Times New Roman" w:cs="Times New Roman"/>
+          <w:kern w:val="0"/>
+          <w14:ligatures w14:val="none"/>
+        </w:rPr>
+        <w:t>Operan</w:t>
+      </w:r>
+      <w:r>
+        <w:rPr>
+          <w:rFonts w:ascii="Times New Roman" w:eastAsia="Times New Roman" w:hAnsi="Times New Roman" w:cs="Times New Roman"/>
+          <w:kern w:val="0"/>
+          <w14:ligatures w14:val="none"/>
+        </w:rPr>
+        <w:t>tion.</w:t>
       </w:r>
     </w:p>
     <w:p>
@@ -5384,7 +5492,7 @@
           <w:kern w:val="0"/>
         </w:rPr>
         <w:lastRenderedPageBreak/>
-        <w:pict w14:anchorId="0C72B4F2">
+        <w:pict w14:anchorId="695603B7">
           <v:rect id="_x0000_i1050" alt="" style="width:468pt;height:.05pt;mso-width-percent:0;mso-height-percent:0;mso-width-percent:0;mso-height-percent:0" o:hralign="center" o:hrstd="t" o:hr="t" fillcolor="#a0a0a0" stroked="f"/>
         </w:pict>
       </w:r>
@@ -5982,7 +6090,7 @@
           <w:noProof/>
           <w:kern w:val="0"/>
         </w:rPr>
-        <w:pict w14:anchorId="125EC0DC">
+        <w:pict w14:anchorId="4E643938">
           <v:rect id="_x0000_i1049" alt="" style="width:468pt;height:.05pt;mso-width-percent:0;mso-height-percent:0;mso-width-percent:0;mso-height-percent:0" o:hralign="center" o:hrstd="t" o:hr="t" fillcolor="#a0a0a0" stroked="f"/>
         </w:pict>
       </w:r>
@@ -6744,7 +6852,7 @@
           <w:noProof/>
           <w:kern w:val="0"/>
         </w:rPr>
-        <w:pict w14:anchorId="28BC2DB3">
+        <w:pict w14:anchorId="4B04E3AF">
           <v:rect id="_x0000_i1048" alt="" style="width:468pt;height:.05pt;mso-width-percent:0;mso-height-percent:0;mso-width-percent:0;mso-height-percent:0" o:hralign="center" o:hrstd="t" o:hr="t" fillcolor="#a0a0a0" stroked="f"/>
         </w:pict>
       </w:r>
@@ -7670,7 +7778,7 @@
           <w:noProof/>
           <w:kern w:val="0"/>
         </w:rPr>
-        <w:pict w14:anchorId="20E7C626">
+        <w:pict w14:anchorId="1BD561B7">
           <v:rect id="_x0000_i1047" alt="" style="width:468pt;height:.05pt;mso-width-percent:0;mso-height-percent:0;mso-width-percent:0;mso-height-percent:0" o:hralign="center" o:hrstd="t" o:hr="t" fillcolor="#a0a0a0" stroked="f"/>
         </w:pict>
       </w:r>
@@ -8130,7 +8238,7 @@
           <w:noProof/>
           <w:kern w:val="0"/>
         </w:rPr>
-        <w:pict w14:anchorId="3FCB11C2">
+        <w:pict w14:anchorId="00CCAE27">
           <v:rect id="_x0000_i1046" alt="" style="width:468pt;height:.05pt;mso-width-percent:0;mso-height-percent:0;mso-width-percent:0;mso-height-percent:0" o:hralign="center" o:hrstd="t" o:hr="t" fillcolor="#a0a0a0" stroked="f"/>
         </w:pict>
       </w:r>
@@ -8590,7 +8698,7 @@
           <w:noProof/>
           <w:kern w:val="0"/>
         </w:rPr>
-        <w:pict w14:anchorId="068180C7">
+        <w:pict w14:anchorId="434539C7">
           <v:rect id="_x0000_i1045" alt="" style="width:468pt;height:.05pt;mso-width-percent:0;mso-height-percent:0;mso-width-percent:0;mso-height-percent:0" o:hralign="center" o:hrstd="t" o:hr="t" fillcolor="#a0a0a0" stroked="f"/>
         </w:pict>
       </w:r>
@@ -8934,7 +9042,7 @@
           <w:noProof/>
           <w:kern w:val="0"/>
         </w:rPr>
-        <w:pict w14:anchorId="4AA63E7E">
+        <w:pict w14:anchorId="6F0F6319">
           <v:rect id="_x0000_i1044" alt="" style="width:468pt;height:.05pt;mso-width-percent:0;mso-height-percent:0;mso-width-percent:0;mso-height-percent:0" o:hralign="center" o:hrstd="t" o:hr="t" fillcolor="#a0a0a0" stroked="f"/>
         </w:pict>
       </w:r>
@@ -9442,7 +9550,7 @@
           <w:noProof/>
           <w:kern w:val="0"/>
         </w:rPr>
-        <w:pict w14:anchorId="2A5AFEBE">
+        <w:pict w14:anchorId="6E6AF2D5">
           <v:rect id="_x0000_i1043" alt="" style="width:468pt;height:.05pt;mso-width-percent:0;mso-height-percent:0;mso-width-percent:0;mso-height-percent:0" o:hralign="center" o:hrstd="t" o:hr="t" fillcolor="#a0a0a0" stroked="f"/>
         </w:pict>
       </w:r>
@@ -9968,7 +10076,7 @@
           <w:noProof/>
           <w:kern w:val="0"/>
         </w:rPr>
-        <w:pict w14:anchorId="464E2B43">
+        <w:pict w14:anchorId="1F45C1C5">
           <v:rect id="_x0000_i1042" alt="" style="width:468pt;height:.05pt;mso-width-percent:0;mso-height-percent:0;mso-width-percent:0;mso-height-percent:0" o:hralign="center" o:hrstd="t" o:hr="t" fillcolor="#a0a0a0" stroked="f"/>
         </w:pict>
       </w:r>
@@ -10042,7 +10150,23 @@
           <w:kern w:val="0"/>
           <w14:ligatures w14:val="none"/>
         </w:rPr>
-        <w:t>Decouple orchestration from model vendors.</w:t>
+        <w:t xml:space="preserve">Decouple </w:t>
+      </w:r>
+      <w:r>
+        <w:rPr>
+          <w:rFonts w:ascii="Times New Roman" w:eastAsia="Times New Roman" w:hAnsi="Times New Roman" w:cs="Times New Roman"/>
+          <w:kern w:val="0"/>
+          <w14:ligatures w14:val="none"/>
+        </w:rPr>
+        <w:t>Operan</w:t>
+      </w:r>
+      <w:r>
+        <w:rPr>
+          <w:rFonts w:ascii="Times New Roman" w:eastAsia="Times New Roman" w:hAnsi="Times New Roman" w:cs="Times New Roman"/>
+          <w:kern w:val="0"/>
+          <w14:ligatures w14:val="none"/>
+        </w:rPr>
+        <w:t>tion from model vendors.</w:t>
       </w:r>
     </w:p>
     <w:p>
@@ -10334,7 +10458,7 @@
           <w:noProof/>
           <w:kern w:val="0"/>
         </w:rPr>
-        <w:pict w14:anchorId="076FCAE1">
+        <w:pict w14:anchorId="7878E786">
           <v:rect id="_x0000_i1041" alt="" style="width:468pt;height:.05pt;mso-width-percent:0;mso-height-percent:0;mso-width-percent:0;mso-height-percent:0" o:hralign="center" o:hrstd="t" o:hr="t" fillcolor="#a0a0a0" stroked="f"/>
         </w:pict>
       </w:r>
@@ -10869,7 +10993,7 @@
           <w:noProof/>
           <w:kern w:val="0"/>
         </w:rPr>
-        <w:pict w14:anchorId="7941804F">
+        <w:pict w14:anchorId="2CBAE2FF">
           <v:rect id="_x0000_i1040" alt="" style="width:468pt;height:.05pt;mso-width-percent:0;mso-height-percent:0;mso-width-percent:0;mso-height-percent:0" o:hralign="center" o:hrstd="t" o:hr="t" fillcolor="#a0a0a0" stroked="f"/>
         </w:pict>
       </w:r>
@@ -11192,7 +11316,7 @@
           <w:noProof/>
           <w:kern w:val="0"/>
         </w:rPr>
-        <w:pict w14:anchorId="0E9E5AA3">
+        <w:pict w14:anchorId="340468FC">
           <v:rect id="_x0000_i1039" alt="" style="width:468pt;height:.05pt;mso-width-percent:0;mso-height-percent:0;mso-width-percent:0;mso-height-percent:0" o:hralign="center" o:hrstd="t" o:hr="t" fillcolor="#a0a0a0" stroked="f"/>
         </w:pict>
       </w:r>
@@ -11536,7 +11660,7 @@
           <w:noProof/>
           <w:kern w:val="0"/>
         </w:rPr>
-        <w:pict w14:anchorId="333C5A04">
+        <w:pict w14:anchorId="73BD5270">
           <v:rect id="_x0000_i1038" alt="" style="width:468pt;height:.05pt;mso-width-percent:0;mso-height-percent:0;mso-width-percent:0;mso-height-percent:0" o:hralign="center" o:hrstd="t" o:hr="t" fillcolor="#a0a0a0" stroked="f"/>
         </w:pict>
       </w:r>
@@ -11766,7 +11890,7 @@
           <w:noProof/>
           <w:kern w:val="0"/>
         </w:rPr>
-        <w:pict w14:anchorId="63113DCE">
+        <w:pict w14:anchorId="67F18ADA">
           <v:rect id="_x0000_i1037" alt="" style="width:468pt;height:.05pt;mso-width-percent:0;mso-height-percent:0;mso-width-percent:0;mso-height-percent:0" o:hralign="center" o:hrstd="t" o:hr="t" fillcolor="#a0a0a0" stroked="f"/>
         </w:pict>
       </w:r>
@@ -11995,7 +12119,7 @@
           <w:noProof/>
           <w:kern w:val="0"/>
         </w:rPr>
-        <w:pict w14:anchorId="18E39BE8">
+        <w:pict w14:anchorId="221D46A5">
           <v:rect id="_x0000_i1036" alt="" style="width:468pt;height:.05pt;mso-width-percent:0;mso-height-percent:0;mso-width-percent:0;mso-height-percent:0" o:hralign="center" o:hrstd="t" o:hr="t" fillcolor="#a0a0a0" stroked="f"/>
         </w:pict>
       </w:r>
@@ -12289,7 +12413,7 @@
           <w:noProof/>
           <w:kern w:val="0"/>
         </w:rPr>
-        <w:pict w14:anchorId="418F87D2">
+        <w:pict w14:anchorId="5707A112">
           <v:rect id="_x0000_i1035" alt="" style="width:468pt;height:.05pt;mso-width-percent:0;mso-height-percent:0;mso-width-percent:0;mso-height-percent:0" o:hralign="center" o:hrstd="t" o:hr="t" fillcolor="#a0a0a0" stroked="f"/>
         </w:pict>
       </w:r>
@@ -12585,7 +12709,7 @@
           <w:noProof/>
           <w:kern w:val="0"/>
         </w:rPr>
-        <w:pict w14:anchorId="2E9FB831">
+        <w:pict w14:anchorId="7BF38A06">
           <v:rect id="_x0000_i1034" alt="" style="width:468pt;height:.05pt;mso-width-percent:0;mso-height-percent:0;mso-width-percent:0;mso-height-percent:0" o:hralign="center" o:hrstd="t" o:hr="t" fillcolor="#a0a0a0" stroked="f"/>
         </w:pict>
       </w:r>
@@ -12884,7 +13008,7 @@
           <w:noProof/>
           <w:kern w:val="0"/>
         </w:rPr>
-        <w:pict w14:anchorId="62D83F49">
+        <w:pict w14:anchorId="20DF34BA">
           <v:rect id="_x0000_i1033" alt="" style="width:468pt;height:.05pt;mso-width-percent:0;mso-height-percent:0;mso-width-percent:0;mso-height-percent:0" o:hralign="center" o:hrstd="t" o:hr="t" fillcolor="#a0a0a0" stroked="f"/>
         </w:pict>
       </w:r>
@@ -13372,7 +13496,7 @@
           <w:noProof/>
           <w:kern w:val="0"/>
         </w:rPr>
-        <w:pict w14:anchorId="3A83A047">
+        <w:pict w14:anchorId="31B41D56">
           <v:rect id="_x0000_i1032" alt="" style="width:468pt;height:.05pt;mso-width-percent:0;mso-height-percent:0;mso-width-percent:0;mso-height-percent:0" o:hralign="center" o:hrstd="t" o:hr="t" fillcolor="#a0a0a0" stroked="f"/>
         </w:pict>
       </w:r>
@@ -13819,7 +13943,7 @@
           <w:noProof/>
           <w:kern w:val="0"/>
         </w:rPr>
-        <w:pict w14:anchorId="375534B4">
+        <w:pict w14:anchorId="0C2052D1">
           <v:rect id="_x0000_i1031" alt="" style="width:468pt;height:.05pt;mso-width-percent:0;mso-height-percent:0;mso-width-percent:0;mso-height-percent:0" o:hralign="center" o:hrstd="t" o:hr="t" fillcolor="#a0a0a0" stroked="f"/>
         </w:pict>
       </w:r>
@@ -14074,7 +14198,7 @@
           <w:noProof/>
           <w:kern w:val="0"/>
         </w:rPr>
-        <w:pict w14:anchorId="5741CE13">
+        <w:pict w14:anchorId="27F39FC6">
           <v:rect id="_x0000_i1030" alt="" style="width:468pt;height:.05pt;mso-width-percent:0;mso-height-percent:0;mso-width-percent:0;mso-height-percent:0" o:hralign="center" o:hrstd="t" o:hr="t" fillcolor="#a0a0a0" stroked="f"/>
         </w:pict>
       </w:r>
@@ -14324,7 +14448,7 @@
           <w:noProof/>
           <w:kern w:val="0"/>
         </w:rPr>
-        <w:pict w14:anchorId="0BA69DFF">
+        <w:pict w14:anchorId="7E13B39D">
           <v:rect id="_x0000_i1029" alt="" style="width:468pt;height:.05pt;mso-width-percent:0;mso-height-percent:0;mso-width-percent:0;mso-height-percent:0" o:hralign="center" o:hrstd="t" o:hr="t" fillcolor="#a0a0a0" stroked="f"/>
         </w:pict>
       </w:r>
@@ -14557,7 +14681,7 @@
           <w:noProof/>
           <w:kern w:val="0"/>
         </w:rPr>
-        <w:pict w14:anchorId="3C766F58">
+        <w:pict w14:anchorId="24B03A11">
           <v:rect id="_x0000_i1028" alt="" style="width:468pt;height:.05pt;mso-width-percent:0;mso-height-percent:0;mso-width-percent:0;mso-height-percent:0" o:hralign="center" o:hrstd="t" o:hr="t" fillcolor="#a0a0a0" stroked="f"/>
         </w:pict>
       </w:r>
@@ -14785,7 +14909,7 @@
           <w:noProof/>
           <w:kern w:val="0"/>
         </w:rPr>
-        <w:pict w14:anchorId="1D13DCB8">
+        <w:pict w14:anchorId="5B4DC569">
           <v:rect id="_x0000_i1027" alt="" style="width:468pt;height:.05pt;mso-width-percent:0;mso-height-percent:0;mso-width-percent:0;mso-height-percent:0" o:hralign="center" o:hrstd="t" o:hr="t" fillcolor="#a0a0a0" stroked="f"/>
         </w:pict>
       </w:r>
@@ -14863,7 +14987,15 @@
           <w:kern w:val="0"/>
           <w14:ligatures w14:val="none"/>
         </w:rPr>
-        <w:t>orchestration reliability</w:t>
+        <w:t>Operan</w:t>
+      </w:r>
+      <w:r>
+        <w:rPr>
+          <w:rFonts w:ascii="Times New Roman" w:eastAsia="Times New Roman" w:hAnsi="Times New Roman" w:cs="Times New Roman"/>
+          <w:kern w:val="0"/>
+          <w14:ligatures w14:val="none"/>
+        </w:rPr>
+        <w:t>tion reliability</w:t>
       </w:r>
     </w:p>
     <w:p>
@@ -15062,7 +15194,7 @@
           <w:noProof/>
           <w:kern w:val="0"/>
         </w:rPr>
-        <w:pict w14:anchorId="21052A6E">
+        <w:pict w14:anchorId="1307E736">
           <v:rect id="_x0000_i1026" alt="" style="width:468pt;height:.05pt;mso-width-percent:0;mso-height-percent:0;mso-width-percent:0;mso-height-percent:0" o:hralign="center" o:hrstd="t" o:hr="t" fillcolor="#a0a0a0" stroked="f"/>
         </w:pict>
       </w:r>
@@ -15389,7 +15521,7 @@
           <w:noProof/>
           <w:kern w:val="0"/>
         </w:rPr>
-        <w:pict w14:anchorId="08CFCF01">
+        <w:pict w14:anchorId="7BC61CE1">
           <v:rect id="_x0000_i1025" alt="" style="width:468pt;height:.05pt;mso-width-percent:0;mso-height-percent:0;mso-width-percent:0;mso-height-percent:0" o:hralign="center" o:hrstd="t" o:hr="t" fillcolor="#a0a0a0" stroked="f"/>
         </w:pict>
       </w:r>

</xml_diff>